<commit_message>
update mdd doc with SVM metric value
</commit_message>
<xml_diff>
--- a/CustomerRiskPredictor MDD.docx
+++ b/CustomerRiskPredictor MDD.docx
@@ -36,7 +36,7 @@
       </w:r>
       <w:r>
         <w:pict w14:anchorId="3D55D2F8">
-          <v:rect id="_x0000_i1032" style="width:0;height:1.5pt" o:hralign="center" o:hrstd="t" o:hr="t" fillcolor="#a0a0a0" stroked="f"/>
+          <v:rect id="_x0000_i1025" style="width:0;height:1.5pt" o:hralign="center" o:hrstd="t" o:hr="t" fillcolor="#a0a0a0" stroked="f"/>
         </w:pict>
       </w:r>
     </w:p>
@@ -148,13 +148,7 @@
         <w:t xml:space="preserve">. </w:t>
       </w:r>
       <w:r>
-        <w:t xml:space="preserve">The project applies customer risk prediction techniques to detect likely churners using historical telecom data and predictive </w:t>
-      </w:r>
-      <w:r>
-        <w:t>modelling</w:t>
-      </w:r>
-      <w:r>
-        <w:t>.</w:t>
+        <w:t>The project applies customer risk prediction techniques to detect likely churners using historical telecom data and predictive modelling.</w:t>
       </w:r>
     </w:p>
     <w:p>
@@ -759,7 +753,15 @@
         <w:t>Evaluate</w:t>
       </w:r>
       <w:r>
-        <w:t xml:space="preserve"> the models using accuracy, precision, recall, F1 score, confusion matrix, and ROC-AUC.</w:t>
+        <w:t xml:space="preserve"> the </w:t>
+      </w:r>
+      <w:proofErr w:type="gramStart"/>
+      <w:r>
+        <w:t>models</w:t>
+      </w:r>
+      <w:proofErr w:type="gramEnd"/>
+      <w:r>
+        <w:t xml:space="preserve"> using accuracy, precision, recall, F1 score, confusion matrix, and ROC-AUC.</w:t>
       </w:r>
     </w:p>
     <w:p>
@@ -795,7 +797,7 @@
     <w:p>
       <w:r>
         <w:pict w14:anchorId="282A4817">
-          <v:rect id="_x0000_i1033" style="width:0;height:1.5pt" o:hralign="center" o:hrstd="t" o:hr="t" fillcolor="#a0a0a0" stroked="f"/>
+          <v:rect id="_x0000_i1026" style="width:0;height:1.5pt" o:hralign="center" o:hrstd="t" o:hr="t" fillcolor="#a0a0a0" stroked="f"/>
         </w:pict>
       </w:r>
     </w:p>
@@ -822,7 +824,15 @@
     </w:p>
     <w:p>
       <w:r>
-        <w:t>Problem Definition → Data Collection → EDA → Pre-processing → Model Building → Evaluation → Dashboard → Report</w:t>
+        <w:t xml:space="preserve">Problem Definition → Data Collection → EDA → </w:t>
+      </w:r>
+      <w:proofErr w:type="gramStart"/>
+      <w:r>
+        <w:t>Pre-processing</w:t>
+      </w:r>
+      <w:proofErr w:type="gramEnd"/>
+      <w:r>
+        <w:t xml:space="preserve"> → Model Building → Evaluation → Dashboard → Report</w:t>
       </w:r>
     </w:p>
     <w:p>
@@ -918,7 +928,15 @@
           <w:b/>
           <w:bCs/>
         </w:rPr>
-        <w:t>Questions the Churn Model Is Designed to Answer</w:t>
+        <w:t xml:space="preserve">Questions the Churn Model Is Designed to </w:t>
+      </w:r>
+      <w:proofErr w:type="gramStart"/>
+      <w:r>
+        <w:rPr>
+          <w:b/>
+          <w:bCs/>
+        </w:rPr>
+        <w:t>Answer</w:t>
       </w:r>
       <w:r>
         <w:rPr>
@@ -927,6 +945,7 @@
         </w:rPr>
         <w:t xml:space="preserve"> :</w:t>
       </w:r>
+      <w:proofErr w:type="gramEnd"/>
     </w:p>
     <w:p/>
     <w:p>
@@ -993,6 +1012,14 @@
     <w:p>
       <w:r>
         <w:t xml:space="preserve">   The model outputs a churn probability, allowing businesses to prioritize at-risk customers for retention actions.</w:t>
+      </w:r>
+    </w:p>
+    <w:p>
+      <w:r>
+        <w:t>Based on SVM</w:t>
+      </w:r>
+      <w:r>
+        <w:t xml:space="preserve"> model </w:t>
       </w:r>
     </w:p>
     <w:p>
@@ -1033,7 +1060,7 @@
       <w:tblGrid>
         <w:gridCol w:w="1207"/>
         <w:gridCol w:w="882"/>
-        <w:gridCol w:w="4722"/>
+        <w:gridCol w:w="5075"/>
       </w:tblGrid>
       <w:tr>
         <w:trPr>
@@ -1161,7 +1188,10 @@
           </w:tcPr>
           <w:p>
             <w:r>
-              <w:t>66.2%</w:t>
+              <w:t>80</w:t>
+            </w:r>
+            <w:r>
+              <w:t>.2%</w:t>
             </w:r>
           </w:p>
         </w:tc>
@@ -1179,7 +1209,19 @@
           </w:tcPr>
           <w:p>
             <w:r>
-              <w:t>Detects about 2 out of 3 actual churners</w:t>
+              <w:t xml:space="preserve">Detects about </w:t>
+            </w:r>
+            <w:r>
+              <w:t>4</w:t>
+            </w:r>
+            <w:r>
+              <w:t xml:space="preserve"> out of </w:t>
+            </w:r>
+            <w:r>
+              <w:t>5</w:t>
+            </w:r>
+            <w:r>
+              <w:t xml:space="preserve"> actual churners</w:t>
             </w:r>
           </w:p>
         </w:tc>
@@ -1220,7 +1262,16 @@
           </w:tcPr>
           <w:p>
             <w:r>
-              <w:t>88.2%</w:t>
+              <w:t>51</w:t>
+            </w:r>
+            <w:r>
+              <w:t>.</w:t>
+            </w:r>
+            <w:r>
+              <w:t>6</w:t>
+            </w:r>
+            <w:r>
+              <w:t>%</w:t>
             </w:r>
           </w:p>
         </w:tc>
@@ -1238,7 +1289,13 @@
           </w:tcPr>
           <w:p>
             <w:r>
-              <w:t>Most predicted churners are real churners</w:t>
+              <w:t xml:space="preserve">Most predicted churners are </w:t>
+            </w:r>
+            <w:r>
+              <w:t xml:space="preserve">50% </w:t>
+            </w:r>
+            <w:r>
+              <w:t>real churners</w:t>
             </w:r>
           </w:p>
         </w:tc>
@@ -1279,7 +1336,10 @@
           </w:tcPr>
           <w:p>
             <w:r>
-              <w:t>0.756</w:t>
+              <w:t>0</w:t>
+            </w:r>
+            <w:r>
+              <w:t>.628</w:t>
             </w:r>
           </w:p>
         </w:tc>
@@ -2916,6 +2976,7 @@
   <w:style w:type="character" w:default="1" w:styleId="DefaultParagraphFont">
     <w:name w:val="Default Paragraph Font"/>
     <w:uiPriority w:val="1"/>
+    <w:semiHidden/>
     <w:unhideWhenUsed/>
   </w:style>
   <w:style w:type="table" w:default="1" w:styleId="TableNormal">

</xml_diff>